<commit_message>
feat(notifications): deploy SES notification service with Pod Identity and Secrets Manager integration
</commit_message>
<xml_diff>
--- a/docs/Production-grade_infra-terraform_screenshots.docx
+++ b/docs/Production-grade_infra-terraform_screenshots.docx
@@ -1004,6 +1004,9 @@
     </w:p>
     <w:p>
       <w:r>
+        <w:rPr>
+          <w:noProof/>
+        </w:rPr>
         <w:drawing>
           <wp:inline distT="0" distB="0" distL="0" distR="0" wp14:anchorId="4A09BAB5" wp14:editId="6AEEE8A7">
             <wp:extent cx="5943600" cy="1409065"/>
@@ -1043,6 +1046,9 @@
     </w:p>
     <w:p>
       <w:r>
+        <w:rPr>
+          <w:noProof/>
+        </w:rPr>
         <w:drawing>
           <wp:inline distT="0" distB="0" distL="0" distR="0" wp14:anchorId="52D4FB2A" wp14:editId="0FB3A1CB">
             <wp:extent cx="5943600" cy="4394200"/>
@@ -1082,6 +1088,9 @@
     </w:p>
     <w:p>
       <w:r>
+        <w:rPr>
+          <w:noProof/>
+        </w:rPr>
         <w:lastRenderedPageBreak/>
         <w:drawing>
           <wp:inline distT="0" distB="0" distL="0" distR="0" wp14:anchorId="2D2F5255" wp14:editId="13CAEF32">
@@ -1128,6 +1137,9 @@
     </w:p>
     <w:p>
       <w:r>
+        <w:rPr>
+          <w:noProof/>
+        </w:rPr>
         <w:drawing>
           <wp:inline distT="0" distB="0" distL="0" distR="0" wp14:anchorId="7AC694A5" wp14:editId="6159F342">
             <wp:extent cx="5943600" cy="2640965"/>
@@ -1172,6 +1184,9 @@
     </w:p>
     <w:p>
       <w:r>
+        <w:rPr>
+          <w:noProof/>
+        </w:rPr>
         <w:drawing>
           <wp:inline distT="0" distB="0" distL="0" distR="0" wp14:anchorId="70A3B15E" wp14:editId="52D866F2">
             <wp:extent cx="4991100" cy="1238177"/>
@@ -1209,11 +1224,172 @@
         </w:drawing>
       </w:r>
     </w:p>
-    <w:p/>
+    <w:p>
+      <w:r>
+        <w:t>HTTPS:</w:t>
+      </w:r>
+    </w:p>
     <w:p>
       <w:r>
         <w:lastRenderedPageBreak/>
-        <w:t>HTTPS:</w:t>
+        <w:t>Notification Microservice:</w:t>
+      </w:r>
+    </w:p>
+    <w:p>
+      <w:r>
+        <w:drawing>
+          <wp:inline distT="0" distB="0" distL="0" distR="0" wp14:anchorId="01215C44" wp14:editId="62B33DC0">
+            <wp:extent cx="5943600" cy="6140450"/>
+            <wp:effectExtent l="0" t="0" r="0" b="0"/>
+            <wp:docPr id="1981029861" name="Picture 1"/>
+            <wp:cNvGraphicFramePr>
+              <a:graphicFrameLocks xmlns:a="http://schemas.openxmlformats.org/drawingml/2006/main" noChangeAspect="1"/>
+            </wp:cNvGraphicFramePr>
+            <a:graphic xmlns:a="http://schemas.openxmlformats.org/drawingml/2006/main">
+              <a:graphicData uri="http://schemas.openxmlformats.org/drawingml/2006/picture">
+                <pic:pic xmlns:pic="http://schemas.openxmlformats.org/drawingml/2006/picture">
+                  <pic:nvPicPr>
+                    <pic:cNvPr id="1981029861" name=""/>
+                    <pic:cNvPicPr/>
+                  </pic:nvPicPr>
+                  <pic:blipFill>
+                    <a:blip r:embed="rId28"/>
+                    <a:stretch>
+                      <a:fillRect/>
+                    </a:stretch>
+                  </pic:blipFill>
+                  <pic:spPr>
+                    <a:xfrm>
+                      <a:off x="0" y="0"/>
+                      <a:ext cx="5943600" cy="6140450"/>
+                    </a:xfrm>
+                    <a:prstGeom prst="rect">
+                      <a:avLst/>
+                    </a:prstGeom>
+                  </pic:spPr>
+                </pic:pic>
+              </a:graphicData>
+            </a:graphic>
+          </wp:inline>
+        </w:drawing>
+      </w:r>
+    </w:p>
+    <w:p>
+      <w:r>
+        <w:drawing>
+          <wp:inline distT="0" distB="0" distL="0" distR="0" wp14:anchorId="384D9F23" wp14:editId="14DED227">
+            <wp:extent cx="4963218" cy="1638529"/>
+            <wp:effectExtent l="0" t="0" r="0" b="0"/>
+            <wp:docPr id="514900175" name="Picture 1"/>
+            <wp:cNvGraphicFramePr>
+              <a:graphicFrameLocks xmlns:a="http://schemas.openxmlformats.org/drawingml/2006/main" noChangeAspect="1"/>
+            </wp:cNvGraphicFramePr>
+            <a:graphic xmlns:a="http://schemas.openxmlformats.org/drawingml/2006/main">
+              <a:graphicData uri="http://schemas.openxmlformats.org/drawingml/2006/picture">
+                <pic:pic xmlns:pic="http://schemas.openxmlformats.org/drawingml/2006/picture">
+                  <pic:nvPicPr>
+                    <pic:cNvPr id="514900175" name=""/>
+                    <pic:cNvPicPr/>
+                  </pic:nvPicPr>
+                  <pic:blipFill>
+                    <a:blip r:embed="rId29"/>
+                    <a:stretch>
+                      <a:fillRect/>
+                    </a:stretch>
+                  </pic:blipFill>
+                  <pic:spPr>
+                    <a:xfrm>
+                      <a:off x="0" y="0"/>
+                      <a:ext cx="4963218" cy="1638529"/>
+                    </a:xfrm>
+                    <a:prstGeom prst="rect">
+                      <a:avLst/>
+                    </a:prstGeom>
+                  </pic:spPr>
+                </pic:pic>
+              </a:graphicData>
+            </a:graphic>
+          </wp:inline>
+        </w:drawing>
+      </w:r>
+    </w:p>
+    <w:p>
+      <w:r>
+        <w:lastRenderedPageBreak/>
+        <w:drawing>
+          <wp:inline distT="0" distB="0" distL="0" distR="0" wp14:anchorId="309D967C" wp14:editId="3F67F059">
+            <wp:extent cx="5943600" cy="567055"/>
+            <wp:effectExtent l="0" t="0" r="0" b="4445"/>
+            <wp:docPr id="2012290928" name="Picture 1"/>
+            <wp:cNvGraphicFramePr>
+              <a:graphicFrameLocks xmlns:a="http://schemas.openxmlformats.org/drawingml/2006/main" noChangeAspect="1"/>
+            </wp:cNvGraphicFramePr>
+            <a:graphic xmlns:a="http://schemas.openxmlformats.org/drawingml/2006/main">
+              <a:graphicData uri="http://schemas.openxmlformats.org/drawingml/2006/picture">
+                <pic:pic xmlns:pic="http://schemas.openxmlformats.org/drawingml/2006/picture">
+                  <pic:nvPicPr>
+                    <pic:cNvPr id="2012290928" name=""/>
+                    <pic:cNvPicPr/>
+                  </pic:nvPicPr>
+                  <pic:blipFill>
+                    <a:blip r:embed="rId30"/>
+                    <a:stretch>
+                      <a:fillRect/>
+                    </a:stretch>
+                  </pic:blipFill>
+                  <pic:spPr>
+                    <a:xfrm>
+                      <a:off x="0" y="0"/>
+                      <a:ext cx="5943600" cy="567055"/>
+                    </a:xfrm>
+                    <a:prstGeom prst="rect">
+                      <a:avLst/>
+                    </a:prstGeom>
+                  </pic:spPr>
+                </pic:pic>
+              </a:graphicData>
+            </a:graphic>
+          </wp:inline>
+        </w:drawing>
+      </w:r>
+    </w:p>
+    <w:p>
+      <w:r>
+        <w:drawing>
+          <wp:inline distT="0" distB="0" distL="0" distR="0" wp14:anchorId="511A458F" wp14:editId="2A0AC103">
+            <wp:extent cx="5943600" cy="2439035"/>
+            <wp:effectExtent l="0" t="0" r="0" b="0"/>
+            <wp:docPr id="128047991" name="Picture 1"/>
+            <wp:cNvGraphicFramePr>
+              <a:graphicFrameLocks xmlns:a="http://schemas.openxmlformats.org/drawingml/2006/main" noChangeAspect="1"/>
+            </wp:cNvGraphicFramePr>
+            <a:graphic xmlns:a="http://schemas.openxmlformats.org/drawingml/2006/main">
+              <a:graphicData uri="http://schemas.openxmlformats.org/drawingml/2006/picture">
+                <pic:pic xmlns:pic="http://schemas.openxmlformats.org/drawingml/2006/picture">
+                  <pic:nvPicPr>
+                    <pic:cNvPr id="128047991" name=""/>
+                    <pic:cNvPicPr/>
+                  </pic:nvPicPr>
+                  <pic:blipFill>
+                    <a:blip r:embed="rId31"/>
+                    <a:stretch>
+                      <a:fillRect/>
+                    </a:stretch>
+                  </pic:blipFill>
+                  <pic:spPr>
+                    <a:xfrm>
+                      <a:off x="0" y="0"/>
+                      <a:ext cx="5943600" cy="2439035"/>
+                    </a:xfrm>
+                    <a:prstGeom prst="rect">
+                      <a:avLst/>
+                    </a:prstGeom>
+                  </pic:spPr>
+                </pic:pic>
+              </a:graphicData>
+            </a:graphic>
+          </wp:inline>
+        </w:drawing>
       </w:r>
     </w:p>
     <w:p/>

</xml_diff>

<commit_message>
Implement production-ready Helm chart for usermgmt service with HPA, Secrets Manager CSI integration, Pod Identity, and RDS ExternalName service
</commit_message>
<xml_diff>
--- a/docs/Production-grade_infra-terraform_screenshots.docx
+++ b/docs/Production-grade_infra-terraform_screenshots.docx
@@ -1237,6 +1237,9 @@
     </w:p>
     <w:p>
       <w:r>
+        <w:rPr>
+          <w:noProof/>
+        </w:rPr>
         <w:drawing>
           <wp:inline distT="0" distB="0" distL="0" distR="0" wp14:anchorId="01215C44" wp14:editId="62B33DC0">
             <wp:extent cx="5943600" cy="6140450"/>
@@ -1276,6 +1279,9 @@
     </w:p>
     <w:p>
       <w:r>
+        <w:rPr>
+          <w:noProof/>
+        </w:rPr>
         <w:drawing>
           <wp:inline distT="0" distB="0" distL="0" distR="0" wp14:anchorId="384D9F23" wp14:editId="14DED227">
             <wp:extent cx="4963218" cy="1638529"/>
@@ -1315,6 +1321,9 @@
     </w:p>
     <w:p>
       <w:r>
+        <w:rPr>
+          <w:noProof/>
+        </w:rPr>
         <w:lastRenderedPageBreak/>
         <w:drawing>
           <wp:inline distT="0" distB="0" distL="0" distR="0" wp14:anchorId="309D967C" wp14:editId="3F67F059">
@@ -1355,6 +1364,9 @@
     </w:p>
     <w:p>
       <w:r>
+        <w:rPr>
+          <w:noProof/>
+        </w:rPr>
         <w:drawing>
           <wp:inline distT="0" distB="0" distL="0" distR="0" wp14:anchorId="511A458F" wp14:editId="2A0AC103">
             <wp:extent cx="5943600" cy="2439035"/>
@@ -1380,6 +1392,195 @@
                     <a:xfrm>
                       <a:off x="0" y="0"/>
                       <a:ext cx="5943600" cy="2439035"/>
+                    </a:xfrm>
+                    <a:prstGeom prst="rect">
+                      <a:avLst/>
+                    </a:prstGeom>
+                  </pic:spPr>
+                </pic:pic>
+              </a:graphicData>
+            </a:graphic>
+          </wp:inline>
+        </w:drawing>
+      </w:r>
+    </w:p>
+    <w:p/>
+    <w:p/>
+    <w:p/>
+    <w:p/>
+    <w:p/>
+    <w:p/>
+    <w:p/>
+    <w:p/>
+    <w:p/>
+    <w:p/>
+    <w:p/>
+    <w:p/>
+    <w:p/>
+    <w:p/>
+    <w:p/>
+    <w:p/>
+    <w:p>
+      <w:r>
+        <w:lastRenderedPageBreak/>
+        <w:t>usermgmt deployment using helm charts</w:t>
+      </w:r>
+    </w:p>
+    <w:p>
+      <w:r>
+        <w:drawing>
+          <wp:inline distT="0" distB="0" distL="0" distR="0" wp14:anchorId="0C95F12F" wp14:editId="7C559EE3">
+            <wp:extent cx="5943600" cy="5527675"/>
+            <wp:effectExtent l="0" t="0" r="0" b="0"/>
+            <wp:docPr id="1131834416" name="Picture 1"/>
+            <wp:cNvGraphicFramePr>
+              <a:graphicFrameLocks xmlns:a="http://schemas.openxmlformats.org/drawingml/2006/main" noChangeAspect="1"/>
+            </wp:cNvGraphicFramePr>
+            <a:graphic xmlns:a="http://schemas.openxmlformats.org/drawingml/2006/main">
+              <a:graphicData uri="http://schemas.openxmlformats.org/drawingml/2006/picture">
+                <pic:pic xmlns:pic="http://schemas.openxmlformats.org/drawingml/2006/picture">
+                  <pic:nvPicPr>
+                    <pic:cNvPr id="1131834416" name=""/>
+                    <pic:cNvPicPr/>
+                  </pic:nvPicPr>
+                  <pic:blipFill>
+                    <a:blip r:embed="rId32"/>
+                    <a:stretch>
+                      <a:fillRect/>
+                    </a:stretch>
+                  </pic:blipFill>
+                  <pic:spPr>
+                    <a:xfrm>
+                      <a:off x="0" y="0"/>
+                      <a:ext cx="5943600" cy="5527675"/>
+                    </a:xfrm>
+                    <a:prstGeom prst="rect">
+                      <a:avLst/>
+                    </a:prstGeom>
+                  </pic:spPr>
+                </pic:pic>
+              </a:graphicData>
+            </a:graphic>
+          </wp:inline>
+        </w:drawing>
+      </w:r>
+    </w:p>
+    <w:p>
+      <w:pPr>
+        <w:rPr>
+          <w:noProof/>
+        </w:rPr>
+      </w:pPr>
+      <w:r>
+        <w:lastRenderedPageBreak/>
+        <w:drawing>
+          <wp:inline distT="0" distB="0" distL="0" distR="0" wp14:anchorId="1681E1D4" wp14:editId="38B30749">
+            <wp:extent cx="5943600" cy="4566920"/>
+            <wp:effectExtent l="0" t="0" r="0" b="5080"/>
+            <wp:docPr id="1672324505" name="Picture 1"/>
+            <wp:cNvGraphicFramePr>
+              <a:graphicFrameLocks xmlns:a="http://schemas.openxmlformats.org/drawingml/2006/main" noChangeAspect="1"/>
+            </wp:cNvGraphicFramePr>
+            <a:graphic xmlns:a="http://schemas.openxmlformats.org/drawingml/2006/main">
+              <a:graphicData uri="http://schemas.openxmlformats.org/drawingml/2006/picture">
+                <pic:pic xmlns:pic="http://schemas.openxmlformats.org/drawingml/2006/picture">
+                  <pic:nvPicPr>
+                    <pic:cNvPr id="1672324505" name=""/>
+                    <pic:cNvPicPr/>
+                  </pic:nvPicPr>
+                  <pic:blipFill>
+                    <a:blip r:embed="rId33"/>
+                    <a:stretch>
+                      <a:fillRect/>
+                    </a:stretch>
+                  </pic:blipFill>
+                  <pic:spPr>
+                    <a:xfrm>
+                      <a:off x="0" y="0"/>
+                      <a:ext cx="5943600" cy="4566920"/>
+                    </a:xfrm>
+                    <a:prstGeom prst="rect">
+                      <a:avLst/>
+                    </a:prstGeom>
+                  </pic:spPr>
+                </pic:pic>
+              </a:graphicData>
+            </a:graphic>
+          </wp:inline>
+        </w:drawing>
+      </w:r>
+      <w:r>
+        <w:rPr>
+          <w:noProof/>
+        </w:rPr>
+        <w:t xml:space="preserve"> </w:t>
+      </w:r>
+      <w:r>
+        <w:drawing>
+          <wp:inline distT="0" distB="0" distL="0" distR="0" wp14:anchorId="55D7925E" wp14:editId="3E2E19C5">
+            <wp:extent cx="5943600" cy="1861820"/>
+            <wp:effectExtent l="0" t="0" r="0" b="5080"/>
+            <wp:docPr id="1467797512" name="Picture 1"/>
+            <wp:cNvGraphicFramePr>
+              <a:graphicFrameLocks xmlns:a="http://schemas.openxmlformats.org/drawingml/2006/main" noChangeAspect="1"/>
+            </wp:cNvGraphicFramePr>
+            <a:graphic xmlns:a="http://schemas.openxmlformats.org/drawingml/2006/main">
+              <a:graphicData uri="http://schemas.openxmlformats.org/drawingml/2006/picture">
+                <pic:pic xmlns:pic="http://schemas.openxmlformats.org/drawingml/2006/picture">
+                  <pic:nvPicPr>
+                    <pic:cNvPr id="1467797512" name=""/>
+                    <pic:cNvPicPr/>
+                  </pic:nvPicPr>
+                  <pic:blipFill>
+                    <a:blip r:embed="rId34"/>
+                    <a:stretch>
+                      <a:fillRect/>
+                    </a:stretch>
+                  </pic:blipFill>
+                  <pic:spPr>
+                    <a:xfrm>
+                      <a:off x="0" y="0"/>
+                      <a:ext cx="5943600" cy="1861820"/>
+                    </a:xfrm>
+                    <a:prstGeom prst="rect">
+                      <a:avLst/>
+                    </a:prstGeom>
+                  </pic:spPr>
+                </pic:pic>
+              </a:graphicData>
+            </a:graphic>
+          </wp:inline>
+        </w:drawing>
+      </w:r>
+    </w:p>
+    <w:p>
+      <w:r>
+        <w:lastRenderedPageBreak/>
+        <w:drawing>
+          <wp:inline distT="0" distB="0" distL="0" distR="0" wp14:anchorId="4C332F2C" wp14:editId="62A58E56">
+            <wp:extent cx="4563112" cy="6573167"/>
+            <wp:effectExtent l="0" t="0" r="8890" b="0"/>
+            <wp:docPr id="2122179304" name="Picture 1"/>
+            <wp:cNvGraphicFramePr>
+              <a:graphicFrameLocks xmlns:a="http://schemas.openxmlformats.org/drawingml/2006/main" noChangeAspect="1"/>
+            </wp:cNvGraphicFramePr>
+            <a:graphic xmlns:a="http://schemas.openxmlformats.org/drawingml/2006/main">
+              <a:graphicData uri="http://schemas.openxmlformats.org/drawingml/2006/picture">
+                <pic:pic xmlns:pic="http://schemas.openxmlformats.org/drawingml/2006/picture">
+                  <pic:nvPicPr>
+                    <pic:cNvPr id="2122179304" name=""/>
+                    <pic:cNvPicPr/>
+                  </pic:nvPicPr>
+                  <pic:blipFill>
+                    <a:blip r:embed="rId35"/>
+                    <a:stretch>
+                      <a:fillRect/>
+                    </a:stretch>
+                  </pic:blipFill>
+                  <pic:spPr>
+                    <a:xfrm>
+                      <a:off x="0" y="0"/>
+                      <a:ext cx="4563112" cy="6573167"/>
                     </a:xfrm>
                     <a:prstGeom prst="rect">
                       <a:avLst/>

</xml_diff>

<commit_message>
Implement Helm charts with HPA, AWS Secrets Manager CSI, Pod Identity, and production security settings for notification service
</commit_message>
<xml_diff>
--- a/docs/Production-grade_infra-terraform_screenshots.docx
+++ b/docs/Production-grade_infra-terraform_screenshots.docx
@@ -1428,6 +1428,9 @@
     </w:p>
     <w:p>
       <w:r>
+        <w:rPr>
+          <w:noProof/>
+        </w:rPr>
         <w:drawing>
           <wp:inline distT="0" distB="0" distL="0" distR="0" wp14:anchorId="0C95F12F" wp14:editId="7C559EE3">
             <wp:extent cx="5943600" cy="5527675"/>
@@ -1472,6 +1475,9 @@
         </w:rPr>
       </w:pPr>
       <w:r>
+        <w:rPr>
+          <w:noProof/>
+        </w:rPr>
         <w:lastRenderedPageBreak/>
         <w:drawing>
           <wp:inline distT="0" distB="0" distL="0" distR="0" wp14:anchorId="1681E1D4" wp14:editId="38B30749">
@@ -1516,6 +1522,9 @@
         <w:t xml:space="preserve"> </w:t>
       </w:r>
       <w:r>
+        <w:rPr>
+          <w:noProof/>
+        </w:rPr>
         <w:drawing>
           <wp:inline distT="0" distB="0" distL="0" distR="0" wp14:anchorId="55D7925E" wp14:editId="3E2E19C5">
             <wp:extent cx="5943600" cy="1861820"/>
@@ -1555,6 +1564,9 @@
     </w:p>
     <w:p>
       <w:r>
+        <w:rPr>
+          <w:noProof/>
+        </w:rPr>
         <w:lastRenderedPageBreak/>
         <w:drawing>
           <wp:inline distT="0" distB="0" distL="0" distR="0" wp14:anchorId="4C332F2C" wp14:editId="62A58E56">
@@ -1591,6 +1603,634 @@
             </a:graphic>
           </wp:inline>
         </w:drawing>
+      </w:r>
+    </w:p>
+    <w:p/>
+    <w:p>
+      <w:r>
+        <w:t>Notification service deployment using helm charts:</w:t>
+      </w:r>
+    </w:p>
+    <w:p>
+      <w:r>
+        <w:lastRenderedPageBreak/>
+        <w:drawing>
+          <wp:inline distT="0" distB="0" distL="0" distR="0" wp14:anchorId="20D8E9F9" wp14:editId="3C94AD94">
+            <wp:extent cx="5300345" cy="8229600"/>
+            <wp:effectExtent l="0" t="0" r="0" b="0"/>
+            <wp:docPr id="2003996505" name="Picture 1"/>
+            <wp:cNvGraphicFramePr>
+              <a:graphicFrameLocks xmlns:a="http://schemas.openxmlformats.org/drawingml/2006/main" noChangeAspect="1"/>
+            </wp:cNvGraphicFramePr>
+            <a:graphic xmlns:a="http://schemas.openxmlformats.org/drawingml/2006/main">
+              <a:graphicData uri="http://schemas.openxmlformats.org/drawingml/2006/picture">
+                <pic:pic xmlns:pic="http://schemas.openxmlformats.org/drawingml/2006/picture">
+                  <pic:nvPicPr>
+                    <pic:cNvPr id="2003996505" name=""/>
+                    <pic:cNvPicPr/>
+                  </pic:nvPicPr>
+                  <pic:blipFill>
+                    <a:blip r:embed="rId36"/>
+                    <a:stretch>
+                      <a:fillRect/>
+                    </a:stretch>
+                  </pic:blipFill>
+                  <pic:spPr>
+                    <a:xfrm>
+                      <a:off x="0" y="0"/>
+                      <a:ext cx="5300345" cy="8229600"/>
+                    </a:xfrm>
+                    <a:prstGeom prst="rect">
+                      <a:avLst/>
+                    </a:prstGeom>
+                  </pic:spPr>
+                </pic:pic>
+              </a:graphicData>
+            </a:graphic>
+          </wp:inline>
+        </w:drawing>
+      </w:r>
+    </w:p>
+    <w:p>
+      <w:r>
+        <w:lastRenderedPageBreak/>
+        <w:drawing>
+          <wp:inline distT="0" distB="0" distL="0" distR="0" wp14:anchorId="4CE73820" wp14:editId="7A5367E7">
+            <wp:extent cx="5943600" cy="3587115"/>
+            <wp:effectExtent l="0" t="0" r="0" b="0"/>
+            <wp:docPr id="132512623" name="Picture 1"/>
+            <wp:cNvGraphicFramePr>
+              <a:graphicFrameLocks xmlns:a="http://schemas.openxmlformats.org/drawingml/2006/main" noChangeAspect="1"/>
+            </wp:cNvGraphicFramePr>
+            <a:graphic xmlns:a="http://schemas.openxmlformats.org/drawingml/2006/main">
+              <a:graphicData uri="http://schemas.openxmlformats.org/drawingml/2006/picture">
+                <pic:pic xmlns:pic="http://schemas.openxmlformats.org/drawingml/2006/picture">
+                  <pic:nvPicPr>
+                    <pic:cNvPr id="132512623" name=""/>
+                    <pic:cNvPicPr/>
+                  </pic:nvPicPr>
+                  <pic:blipFill>
+                    <a:blip r:embed="rId37"/>
+                    <a:stretch>
+                      <a:fillRect/>
+                    </a:stretch>
+                  </pic:blipFill>
+                  <pic:spPr>
+                    <a:xfrm>
+                      <a:off x="0" y="0"/>
+                      <a:ext cx="5943600" cy="3587115"/>
+                    </a:xfrm>
+                    <a:prstGeom prst="rect">
+                      <a:avLst/>
+                    </a:prstGeom>
+                  </pic:spPr>
+                </pic:pic>
+              </a:graphicData>
+            </a:graphic>
+          </wp:inline>
+        </w:drawing>
+      </w:r>
+    </w:p>
+    <w:p>
+      <w:r>
+        <w:t>Administrator@DESKTOP-FCQQ0BG MINGW64 /c/aws-eks-platform-engineering/helm/notification-chart (main)</w:t>
+      </w:r>
+    </w:p>
+    <w:p>
+      <w:r>
+        <w:t>$ kubectl describe deployment notification</w:t>
+      </w:r>
+    </w:p>
+    <w:p>
+      <w:r>
+        <w:t>Name:                   notification</w:t>
+      </w:r>
+    </w:p>
+    <w:p>
+      <w:r>
+        <w:t>Namespace:              default</w:t>
+      </w:r>
+    </w:p>
+    <w:p>
+      <w:r>
+        <w:t>CreationTimestamp:      Sat, 27 Jun 2026 23:28:37 -0400</w:t>
+      </w:r>
+    </w:p>
+    <w:p>
+      <w:r>
+        <w:t>Labels:                 app.kubernetes.io/instance=notification</w:t>
+      </w:r>
+    </w:p>
+    <w:p>
+      <w:r>
+        <w:t xml:space="preserve">                        app.kubernetes.io/managed-by=Helm</w:t>
+      </w:r>
+    </w:p>
+    <w:p>
+      <w:r>
+        <w:t xml:space="preserve">                        app.kubernetes.io/name=notification</w:t>
+      </w:r>
+    </w:p>
+    <w:p>
+      <w:r>
+        <w:t xml:space="preserve">                        app.kubernetes.io/version=1.0.0</w:t>
+      </w:r>
+    </w:p>
+    <w:p>
+      <w:r>
+        <w:t xml:space="preserve">                        helm.sh/chart=notification-0.1.0</w:t>
+      </w:r>
+    </w:p>
+    <w:p>
+      <w:r>
+        <w:t>Annotations:            deployment.kubernetes.io/revision: 1</w:t>
+      </w:r>
+    </w:p>
+    <w:p>
+      <w:r>
+        <w:t xml:space="preserve">                        meta.helm.sh/release-name: notification</w:t>
+      </w:r>
+    </w:p>
+    <w:p>
+      <w:r>
+        <w:t xml:space="preserve">                        meta.helm.sh/release-namespace: default</w:t>
+      </w:r>
+    </w:p>
+    <w:p>
+      <w:r>
+        <w:lastRenderedPageBreak/>
+        <w:t>Selector:               app.kubernetes.io/instance=notification,app.kubernetes.io/name=notification</w:t>
+      </w:r>
+    </w:p>
+    <w:p>
+      <w:r>
+        <w:t>Replicas:               2 desired | 2 updated | 2 total | 2 available | 0 unavailable</w:t>
+      </w:r>
+    </w:p>
+    <w:p>
+      <w:r>
+        <w:t>StrategyType:           RollingUpdate</w:t>
+      </w:r>
+    </w:p>
+    <w:p>
+      <w:r>
+        <w:t>MinReadySeconds:        0</w:t>
+      </w:r>
+    </w:p>
+    <w:p>
+      <w:r>
+        <w:t>RollingUpdateStrategy:  25% max unavailable, 25% max surge</w:t>
+      </w:r>
+    </w:p>
+    <w:p>
+      <w:r>
+        <w:t>Pod Template:</w:t>
+      </w:r>
+    </w:p>
+    <w:p>
+      <w:r>
+        <w:t xml:space="preserve">  Labels:           app.kubernetes.io/instance=notification</w:t>
+      </w:r>
+    </w:p>
+    <w:p>
+      <w:r>
+        <w:t xml:space="preserve">                    app.kubernetes.io/name=notification</w:t>
+      </w:r>
+    </w:p>
+    <w:p>
+      <w:r>
+        <w:t xml:space="preserve">  Annotations:      prometheus.io/path: /actuator/prometheus</w:t>
+      </w:r>
+    </w:p>
+    <w:p>
+      <w:r>
+        <w:t xml:space="preserve">                    prometheus.io/port: 8096</w:t>
+      </w:r>
+    </w:p>
+    <w:p>
+      <w:r>
+        <w:t xml:space="preserve">                    prometheus.io/scrape: true</w:t>
+      </w:r>
+    </w:p>
+    <w:p>
+      <w:r>
+        <w:t xml:space="preserve">  Service Account:  notification</w:t>
+      </w:r>
+    </w:p>
+    <w:p>
+      <w:r>
+        <w:t xml:space="preserve">  Containers:</w:t>
+      </w:r>
+    </w:p>
+    <w:p>
+      <w:r>
+        <w:t xml:space="preserve">   notification:</w:t>
+      </w:r>
+    </w:p>
+    <w:p>
+      <w:r>
+        <w:t xml:space="preserve">    Image:      stacksimplify/kube-notifications-microservice:1.0.0</w:t>
+      </w:r>
+    </w:p>
+    <w:p>
+      <w:r>
+        <w:t xml:space="preserve">    Port:       8096/TCP (http)</w:t>
+      </w:r>
+    </w:p>
+    <w:p>
+      <w:r>
+        <w:t xml:space="preserve">    Host Port:  0/TCP (http)</w:t>
+      </w:r>
+    </w:p>
+    <w:p>
+      <w:r>
+        <w:t xml:space="preserve">    Limits:</w:t>
+      </w:r>
+    </w:p>
+    <w:p>
+      <w:r>
+        <w:t xml:space="preserve">      cpu:     1</w:t>
+      </w:r>
+    </w:p>
+    <w:p>
+      <w:r>
+        <w:t xml:space="preserve">      memory:  1Gi</w:t>
+      </w:r>
+    </w:p>
+    <w:p>
+      <w:r>
+        <w:t xml:space="preserve">    Requests:</w:t>
+      </w:r>
+    </w:p>
+    <w:p>
+      <w:r>
+        <w:t xml:space="preserve">      cpu:      250m</w:t>
+      </w:r>
+    </w:p>
+    <w:p>
+      <w:r>
+        <w:t xml:space="preserve">      memory:   512Mi</w:t>
+      </w:r>
+    </w:p>
+    <w:p>
+      <w:r>
+        <w:t xml:space="preserve">    Liveness:   tcp-socket :http delay=60s timeout=1s period=10s #success=1 #failure=3</w:t>
+      </w:r>
+    </w:p>
+    <w:p>
+      <w:r>
+        <w:t xml:space="preserve">    Readiness:  tcp-socket :http delay=30s timeout=1s period=10s #success=1 #failure=3</w:t>
+      </w:r>
+    </w:p>
+    <w:p>
+      <w:r>
+        <w:lastRenderedPageBreak/>
+        <w:t xml:space="preserve">    Startup:    tcp-socket :http delay=0s timeout=1s period=10s #success=1 #failure=30</w:t>
+      </w:r>
+    </w:p>
+    <w:p>
+      <w:r>
+        <w:t xml:space="preserve">    Environment:</w:t>
+      </w:r>
+    </w:p>
+    <w:p>
+      <w:r>
+        <w:t xml:space="preserve">      AWS_MAIL_SERVER_HOST:          email-smtp.us-east-1.amazonaws.com</w:t>
+      </w:r>
+    </w:p>
+    <w:p>
+      <w:r>
+        <w:t xml:space="preserve">      AWS_MAIL_SERVER_FROM_ADDRESS:  &lt;set to the key 'SMTP_FROM' in secret 'notification-email'&gt;      Optional: false</w:t>
+      </w:r>
+    </w:p>
+    <w:p>
+      <w:r>
+        <w:t xml:space="preserve">      AWS_MAIL_SERVER_USERNAME:      &lt;set to the key 'SMTP_USERNAME' in secret 'notification-email'&gt;  Optional: false</w:t>
+      </w:r>
+    </w:p>
+    <w:p>
+      <w:r>
+        <w:t xml:space="preserve">      AWS_MAIL_SERVER_PASSWORD:      &lt;set to the key 'SMTP_PASSWORD' in secret 'notification-email'&gt;  Optional: false</w:t>
+      </w:r>
+    </w:p>
+    <w:p>
+      <w:r>
+        <w:t xml:space="preserve">    Mounts:</w:t>
+      </w:r>
+    </w:p>
+    <w:p>
+      <w:r>
+        <w:t xml:space="preserve">      /mnt/secrets-store from aws-secrets (ro)</w:t>
+      </w:r>
+    </w:p>
+    <w:p>
+      <w:r>
+        <w:t xml:space="preserve">      /tmp from tmp-volume (rw)</w:t>
+      </w:r>
+    </w:p>
+    <w:p>
+      <w:r>
+        <w:t xml:space="preserve">  Volumes:</w:t>
+      </w:r>
+    </w:p>
+    <w:p>
+      <w:r>
+        <w:t xml:space="preserve">   tmp-volume:</w:t>
+      </w:r>
+    </w:p>
+    <w:p>
+      <w:r>
+        <w:t xml:space="preserve">    Type:       EmptyDir (a temporary directory that shares a pod's lifetime)</w:t>
+      </w:r>
+    </w:p>
+    <w:p>
+      <w:r>
+        <w:t xml:space="preserve">    Medium:     Memory</w:t>
+      </w:r>
+    </w:p>
+    <w:p>
+      <w:r>
+        <w:t xml:space="preserve">    SizeLimit:  &lt;unset&gt;</w:t>
+      </w:r>
+    </w:p>
+    <w:p>
+      <w:r>
+        <w:t xml:space="preserve">   aws-secrets:</w:t>
+      </w:r>
+    </w:p>
+    <w:p>
+      <w:r>
+        <w:t xml:space="preserve">    Type:                       CSI (a Container Storage Interface (CSI) volume source)</w:t>
+      </w:r>
+    </w:p>
+    <w:p>
+      <w:r>
+        <w:t xml:space="preserve">    Driver:                     secrets-store.csi.k8s.io</w:t>
+      </w:r>
+    </w:p>
+    <w:p>
+      <w:r>
+        <w:t xml:space="preserve">    FSType:                     </w:t>
+      </w:r>
+    </w:p>
+    <w:p>
+      <w:r>
+        <w:t xml:space="preserve">    ReadOnly:                   true</w:t>
+      </w:r>
+    </w:p>
+    <w:p>
+      <w:r>
+        <w:t xml:space="preserve">    VolumeAttributes:               secretProviderClass=notification-email-secrets</w:t>
+      </w:r>
+    </w:p>
+    <w:p>
+      <w:r>
+        <w:t xml:space="preserve">  Topology Spread Constraints:  kubernetes.io/hostname:ScheduleAnyway when max skew 1 is exceeded for selector app.kubernetes.io/instance=notification,app.kubernetes.io/name=notification</w:t>
+      </w:r>
+    </w:p>
+    <w:p>
+      <w:r>
+        <w:t xml:space="preserve">                                topology.kubernetes.io/zone:DoNotSchedule when max skew 1 is exceeded for selector app.kubernetes.io/instance=notification,app.kubernetes.io/name=notification</w:t>
+      </w:r>
+    </w:p>
+    <w:p>
+      <w:r>
+        <w:lastRenderedPageBreak/>
+        <w:t xml:space="preserve">  Node-Selectors:               &lt;none&gt;</w:t>
+      </w:r>
+    </w:p>
+    <w:p>
+      <w:r>
+        <w:t xml:space="preserve">  Tolerations:                  &lt;none&gt;</w:t>
+      </w:r>
+    </w:p>
+    <w:p>
+      <w:r>
+        <w:t>Conditions:</w:t>
+      </w:r>
+    </w:p>
+    <w:p>
+      <w:r>
+        <w:t xml:space="preserve">  Type           Status  Reason</w:t>
+      </w:r>
+    </w:p>
+    <w:p>
+      <w:r>
+        <w:t xml:space="preserve">  ----           ------  ------</w:t>
+      </w:r>
+    </w:p>
+    <w:p>
+      <w:r>
+        <w:t xml:space="preserve">  Available      True    MinimumReplicasAvailable</w:t>
+      </w:r>
+    </w:p>
+    <w:p>
+      <w:r>
+        <w:t xml:space="preserve">  Progressing    True    NewReplicaSetAvailable</w:t>
+      </w:r>
+    </w:p>
+    <w:p>
+      <w:r>
+        <w:t>OldReplicaSets:  &lt;none&gt;</w:t>
+      </w:r>
+    </w:p>
+    <w:p>
+      <w:r>
+        <w:t>NewReplicaSet:   notification-7c6f8868c5 (2/2 replicas created)</w:t>
+      </w:r>
+    </w:p>
+    <w:p>
+      <w:r>
+        <w:t>Events:</w:t>
+      </w:r>
+    </w:p>
+    <w:p>
+      <w:r>
+        <w:t xml:space="preserve">  Type    Reason             Age   From                   Message</w:t>
+      </w:r>
+    </w:p>
+    <w:p>
+      <w:r>
+        <w:t xml:space="preserve">  ----    ------             ----  ----                   -------</w:t>
+      </w:r>
+    </w:p>
+    <w:p>
+      <w:r>
+        <w:t xml:space="preserve">  Normal  ScalingReplicaSet  10m   deployment-controller  Scaled up replica set notification-7c6f8868c5 from 0 to 1</w:t>
+      </w:r>
+    </w:p>
+    <w:p>
+      <w:r>
+        <w:t xml:space="preserve">  Normal  ScalingReplicaSet  10m   deployment-controller  Scaled up replica set notification-7c6f8868c5 from 1 to 2</w:t>
+      </w:r>
+    </w:p>
+    <w:p/>
+    <w:p>
+      <w:r>
+        <w:t>Administrator@DESKTOP-FCQQ0BG MINGW64 /c/aws-eks-platform-engineering/helm/notification-chart (main)</w:t>
+      </w:r>
+    </w:p>
+    <w:p>
+      <w:r>
+        <w:t>$ kubectl describe hpa notification</w:t>
+      </w:r>
+    </w:p>
+    <w:p>
+      <w:r>
+        <w:t>Name:                                                     notification</w:t>
+      </w:r>
+    </w:p>
+    <w:p>
+      <w:r>
+        <w:t>Namespace:                                                default</w:t>
+      </w:r>
+    </w:p>
+    <w:p>
+      <w:r>
+        <w:t>Labels:                                                   app.kubernetes.io/instance=notification</w:t>
+      </w:r>
+    </w:p>
+    <w:p>
+      <w:r>
+        <w:t xml:space="preserve">                                                          app.kubernetes.io/managed-by=Helm</w:t>
+      </w:r>
+    </w:p>
+    <w:p>
+      <w:r>
+        <w:t xml:space="preserve">                                                          app.kubernetes.io/name=notification</w:t>
+      </w:r>
+    </w:p>
+    <w:p>
+      <w:r>
+        <w:t xml:space="preserve">                                                          app.kubernetes.io/version=1.0.0</w:t>
+      </w:r>
+    </w:p>
+    <w:p>
+      <w:r>
+        <w:t xml:space="preserve">                                                          helm.sh/chart=notification-0.1.0</w:t>
+      </w:r>
+    </w:p>
+    <w:p>
+      <w:r>
+        <w:lastRenderedPageBreak/>
+        <w:t>Annotations:                                              meta.helm.sh/release-name: notification</w:t>
+      </w:r>
+    </w:p>
+    <w:p>
+      <w:r>
+        <w:t xml:space="preserve">                                                          meta.helm.sh/release-namespace: default</w:t>
+      </w:r>
+    </w:p>
+    <w:p>
+      <w:r>
+        <w:t>CreationTimestamp:                                        Sat, 27 Jun 2026 23:28:37 -0400</w:t>
+      </w:r>
+    </w:p>
+    <w:p>
+      <w:r>
+        <w:t>Reference:                                                Deployment/notification</w:t>
+      </w:r>
+    </w:p>
+    <w:p>
+      <w:r>
+        <w:t>Metrics:                                                  ( current / target )</w:t>
+      </w:r>
+    </w:p>
+    <w:p>
+      <w:r>
+        <w:t xml:space="preserve">  resource cpu on pods  (as a percentage of request):     &lt;unknown&gt; / 70%</w:t>
+      </w:r>
+    </w:p>
+    <w:p>
+      <w:r>
+        <w:t xml:space="preserve">  resource memory on pods  (as a percentage of request):  &lt;unknown&gt; / 80%</w:t>
+      </w:r>
+    </w:p>
+    <w:p>
+      <w:r>
+        <w:t>Min replicas:                                             2</w:t>
+      </w:r>
+    </w:p>
+    <w:p>
+      <w:r>
+        <w:t>Max replicas:                                             5</w:t>
+      </w:r>
+    </w:p>
+    <w:p>
+      <w:r>
+        <w:t>Deployment pods:                                          2 current / 2 desired</w:t>
+      </w:r>
+    </w:p>
+    <w:p>
+      <w:r>
+        <w:t>Conditions:</w:t>
+      </w:r>
+    </w:p>
+    <w:p>
+      <w:r>
+        <w:t xml:space="preserve">  Type           Status  Reason                   Message</w:t>
+      </w:r>
+    </w:p>
+    <w:p>
+      <w:r>
+        <w:t xml:space="preserve">  ----           ------  ------                   -------</w:t>
+      </w:r>
+    </w:p>
+    <w:p>
+      <w:r>
+        <w:t xml:space="preserve">  AbleToScale    True    SucceededGetScale        the HPA controller was able to get the target's current scale</w:t>
+      </w:r>
+    </w:p>
+    <w:p>
+      <w:r>
+        <w:t xml:space="preserve">  ScalingActive  False   FailedGetResourceMetric  the HPA was unable to compute the replica count: failed to get cpu utilization: unable to get metrics for resource cpu: unable to fetch metrics from resource metrics API: the server could not find the requested resource (get pods.metrics.k8s.io)</w:t>
+      </w:r>
+    </w:p>
+    <w:p>
+      <w:r>
+        <w:t>Events:</w:t>
+      </w:r>
+    </w:p>
+    <w:p>
+      <w:r>
+        <w:t xml:space="preserve">  Type     Reason                        Age                  From                       Message</w:t>
+      </w:r>
+    </w:p>
+    <w:p>
+      <w:r>
+        <w:t xml:space="preserve">  ----     ------                        ----                 ----                       -------</w:t>
+      </w:r>
+    </w:p>
+    <w:p>
+      <w:r>
+        <w:t xml:space="preserve">  Normal   SuccessfulRescale             10m                  horizontal-pod-autoscaler  New size: 2; reason: Current number of replicas below Spec.MinReplicas</w:t>
+      </w:r>
+    </w:p>
+    <w:p>
+      <w:r>
+        <w:t xml:space="preserve">  Warning  FailedGetResourceMetric       8m40s (x8 over 10m)  horizontal-pod-autoscaler  failed to get memory utilization: unable to get metrics for resource memory: unable to fetch metrics from resource metrics API: the server could not find the requested resource (get pods.metrics.k8s.io)</w:t>
+      </w:r>
+    </w:p>
+    <w:p>
+      <w:r>
+        <w:lastRenderedPageBreak/>
+        <w:t xml:space="preserve">  Warning  FailedComputeMetricsReplicas  8m40s (x8 over 10m)  horizontal-pod-autoscaler  invalid metrics (2 invalid out of 2), first error is: failed to get cpu resource metric value: failed to get cpu utilization: unable to get metrics for resource cpu: unable to fetch metrics from resource metrics API: the server could not find the requested resource (get pods.metrics.k8s.io)</w:t>
+      </w:r>
+    </w:p>
+    <w:p>
+      <w:r>
+        <w:t xml:space="preserve">  Warning  FailedGetResourceMetric       25s (x41 over 10m)   horizontal-pod-autoscaler  failed to get cpu utilization: unable to get metrics for resource cpu: unable to fetch metrics from resource metrics API: the server could not find the requested resource (get pods.metrics.k8s.io)</w:t>
+      </w:r>
+    </w:p>
+    <w:p/>
+    <w:p>
+      <w:r>
+        <w:t>Administrator@DESKTOP-FCQQ0BG MINGW64 /c/aws-eks-platform-engineering/helm/notification-chart (main)</w:t>
+      </w:r>
+    </w:p>
+    <w:p>
+      <w:r>
+        <w:t>$</w:t>
       </w:r>
     </w:p>
     <w:p/>

</xml_diff>